<commit_message>
Deploy preview for PR 618 🛫
</commit_message>
<xml_diff>
--- a/pr-preview/pr-618/vignettes/articles/version-crosswalk-1.3-to-1.4.docx
+++ b/pr-preview/pr-618/vignettes/articles/version-crosswalk-1.3-to-1.4.docx
@@ -3049,7 +3049,7 @@
         <w:rPr>
           <w:rStyle w:val="CommentTok"/>
         </w:rPr>
-        <w:t xml:space="preserve">#&gt;     age id    antigen_iso     value</w:t>
+        <w:t xml:space="preserve">#&gt;     age id    antigen_iso value</w:t>
       </w:r>
       <w:r>
         <w:br/>
@@ -3058,7 +3058,7 @@
         <w:rPr>
           <w:rStyle w:val="CommentTok"/>
         </w:rPr>
-        <w:t xml:space="preserve">#&gt;   &lt;dbl&gt; &lt;chr&gt; &lt;chr&gt;           &lt;dbl&gt;</w:t>
+        <w:t xml:space="preserve">#&gt;   &lt;dbl&gt; &lt;chr&gt; &lt;chr&gt;       &lt;dbl&gt;</w:t>
       </w:r>
       <w:r>
         <w:br/>
@@ -3067,7 +3067,7 @@
         <w:rPr>
           <w:rStyle w:val="CommentTok"/>
         </w:rPr>
-        <w:t xml:space="preserve">#&gt; 1  1.82 1     HlyE_IgA    16611.   </w:t>
+        <w:t xml:space="preserve">#&gt; 1 14.1  1     HlyE_IgA    0.584</w:t>
       </w:r>
       <w:r>
         <w:br/>
@@ -3076,7 +3076,7 @@
         <w:rPr>
           <w:rStyle w:val="CommentTok"/>
         </w:rPr>
-        <w:t xml:space="preserve">#&gt; 2  1.82 1     HlyE_IgG       24.1  </w:t>
+        <w:t xml:space="preserve">#&gt; 2 14.1  1     HlyE_IgG    0.556</w:t>
       </w:r>
       <w:r>
         <w:br/>
@@ -3085,7 +3085,7 @@
         <w:rPr>
           <w:rStyle w:val="CommentTok"/>
         </w:rPr>
-        <w:t xml:space="preserve">#&gt; 3  8.73 2     HlyE_IgA        0.528</w:t>
+        <w:t xml:space="preserve">#&gt; 3  3.62 2     HlyE_IgA    0.791</w:t>
       </w:r>
       <w:r>
         <w:br/>
@@ -3094,7 +3094,7 @@
         <w:rPr>
           <w:rStyle w:val="CommentTok"/>
         </w:rPr>
-        <w:t xml:space="preserve">#&gt; 4  8.73 2     HlyE_IgG        0.575</w:t>
+        <w:t xml:space="preserve">#&gt; 4  3.62 2     HlyE_IgG    0.913</w:t>
       </w:r>
       <w:r>
         <w:br/>
@@ -3103,7 +3103,7 @@
         <w:rPr>
           <w:rStyle w:val="CommentTok"/>
         </w:rPr>
-        <w:t xml:space="preserve">#&gt; 5 14.4  3     HlyE_IgA        0.624</w:t>
+        <w:t xml:space="preserve">#&gt; 5  0.83 3     HlyE_IgA    0.445</w:t>
       </w:r>
       <w:r>
         <w:br/>
@@ -3112,7 +3112,7 @@
         <w:rPr>
           <w:rStyle w:val="CommentTok"/>
         </w:rPr>
-        <w:t xml:space="preserve">#&gt; 6 14.4  3     HlyE_IgG        0.406</w:t>
+        <w:t xml:space="preserve">#&gt; 6  0.83 3     HlyE_IgG    0.521</w:t>
       </w:r>
       <w:r>
         <w:br/>

</xml_diff>